<commit_message>
Present functional requirements as Table 3 in the paper
Section 4.2 now uses a table (ID, feature, description, main user);
later tables are renumbered 4 to 7 with in-text references updated.

Co-Authored-By: Claude Opus 5.5 <noreply@anthropic.com>
Claude-Session: https://claude.ai/code/session_013E49sPYUyrRbFMqwEdxWwu
</commit_message>
<xml_diff>
--- a/research/Lagera_Baguio_Benguet_AI_Customer_Support_Research_Revised.docx
+++ b/research/Lagera_Baguio_Benguet_AI_Customer_Support_Research_Revised.docx
@@ -2384,125 +2384,1136 @@
         <w:jc w:val="both"/>
       </w:pPr>
       <w:r>
-        <w:t>The prototype's core features are listed below as functional requirements (FR).</w:t>
+        <w:t>Table 3 lists the prototype's core features as functional requirements (FR), together with the main user of each feature.</w:t>
       </w:r>
     </w:p>
     <w:p>
       <w:pPr>
-        <w:pStyle w:val="ListBullet"/>
-        <w:jc w:val="left"/>
+        <w:keepNext/>
+        <w:spacing w:before="120"/>
+        <w:jc w:val="center"/>
       </w:pPr>
       <w:r>
-        <w:t>FR1 Account and login: owners and staff sign in to a dashboard with their own accounts and roles.</w:t>
+        <w:rPr>
+          <w:b/>
+          <w:sz w:val="17"/>
+        </w:rPr>
+        <w:t>Table 3: Platform features and functional requirements</w:t>
       </w:r>
     </w:p>
+    <w:tbl>
+      <w:tblPr>
+        <w:tblW w:w="9360" w:type="dxa"/>
+        <w:jc w:val="center"/>
+        <w:tblBorders>
+          <w:top w:val="single" w:sz="4" w:space="0" w:color="808080"/>
+          <w:left w:val="single" w:sz="4" w:space="0" w:color="808080"/>
+          <w:bottom w:val="single" w:sz="4" w:space="0" w:color="808080"/>
+          <w:right w:val="single" w:sz="4" w:space="0" w:color="808080"/>
+          <w:insideH w:val="single" w:sz="4" w:space="0" w:color="808080"/>
+          <w:insideV w:val="single" w:sz="4" w:space="0" w:color="808080"/>
+        </w:tblBorders>
+        <w:tblLayout w:type="fixed"/>
+        <w:tblLook w:firstColumn="1" w:firstRow="1" w:lastColumn="0" w:lastRow="0" w:noHBand="0" w:noVBand="1" w:val="04A0"/>
+      </w:tblPr>
+      <w:tblGrid>
+        <w:gridCol w:w="802"/>
+        <w:gridCol w:w="2139"/>
+        <w:gridCol w:w="4680"/>
+        <w:gridCol w:w="1738"/>
+      </w:tblGrid>
+      <w:tr>
+        <w:trPr>
+          <w:cantSplit/>
+          <w:tblHeader/>
+        </w:trPr>
+        <w:tc>
+          <w:tcPr>
+            <w:tcW w:type="dxa" w:w="802"/>
+            <w:shd w:val="clear" w:color="auto" w:fill="E8F1F8"/>
+          </w:tcPr>
+          <w:p>
+            <w:pPr>
+              <w:spacing w:after="0"/>
+              <w:jc w:val="left"/>
+            </w:pPr>
+            <w:r/>
+            <w:r>
+              <w:rPr>
+                <w:b/>
+                <w:sz w:val="18"/>
+              </w:rPr>
+              <w:t>ID</w:t>
+            </w:r>
+          </w:p>
+        </w:tc>
+        <w:tc>
+          <w:tcPr>
+            <w:tcW w:type="dxa" w:w="2139"/>
+            <w:shd w:val="clear" w:color="auto" w:fill="E8F1F8"/>
+          </w:tcPr>
+          <w:p>
+            <w:pPr>
+              <w:spacing w:after="0"/>
+              <w:jc w:val="left"/>
+            </w:pPr>
+            <w:r/>
+            <w:r>
+              <w:rPr>
+                <w:b/>
+                <w:sz w:val="18"/>
+              </w:rPr>
+              <w:t>Feature</w:t>
+            </w:r>
+          </w:p>
+        </w:tc>
+        <w:tc>
+          <w:tcPr>
+            <w:tcW w:type="dxa" w:w="4680"/>
+            <w:shd w:val="clear" w:color="auto" w:fill="E8F1F8"/>
+          </w:tcPr>
+          <w:p>
+            <w:pPr>
+              <w:spacing w:after="0"/>
+              <w:jc w:val="left"/>
+            </w:pPr>
+            <w:r/>
+            <w:r>
+              <w:rPr>
+                <w:b/>
+                <w:sz w:val="18"/>
+              </w:rPr>
+              <w:t>Description</w:t>
+            </w:r>
+          </w:p>
+        </w:tc>
+        <w:tc>
+          <w:tcPr>
+            <w:tcW w:type="dxa" w:w="1738"/>
+            <w:shd w:val="clear" w:color="auto" w:fill="E8F1F8"/>
+          </w:tcPr>
+          <w:p>
+            <w:pPr>
+              <w:spacing w:after="0"/>
+              <w:jc w:val="left"/>
+            </w:pPr>
+            <w:r/>
+            <w:r>
+              <w:rPr>
+                <w:b/>
+                <w:sz w:val="18"/>
+              </w:rPr>
+              <w:t>Main user</w:t>
+            </w:r>
+          </w:p>
+        </w:tc>
+      </w:tr>
+      <w:tr>
+        <w:trPr>
+          <w:cantSplit/>
+        </w:trPr>
+        <w:tc>
+          <w:tcPr>
+            <w:tcW w:type="dxa" w:w="802"/>
+          </w:tcPr>
+          <w:p>
+            <w:pPr>
+              <w:spacing w:after="0"/>
+              <w:jc w:val="left"/>
+            </w:pPr>
+            <w:r/>
+            <w:r>
+              <w:rPr>
+                <w:sz w:val="18"/>
+              </w:rPr>
+              <w:t>FR1</w:t>
+            </w:r>
+          </w:p>
+        </w:tc>
+        <w:tc>
+          <w:tcPr>
+            <w:tcW w:type="dxa" w:w="2139"/>
+          </w:tcPr>
+          <w:p>
+            <w:pPr>
+              <w:spacing w:after="0"/>
+              <w:jc w:val="left"/>
+            </w:pPr>
+            <w:r/>
+            <w:r>
+              <w:rPr>
+                <w:sz w:val="18"/>
+              </w:rPr>
+              <w:t>Account and login</w:t>
+            </w:r>
+          </w:p>
+        </w:tc>
+        <w:tc>
+          <w:tcPr>
+            <w:tcW w:type="dxa" w:w="4680"/>
+          </w:tcPr>
+          <w:p>
+            <w:pPr>
+              <w:spacing w:after="0"/>
+              <w:jc w:val="left"/>
+            </w:pPr>
+            <w:r/>
+            <w:r>
+              <w:rPr>
+                <w:sz w:val="18"/>
+              </w:rPr>
+              <w:t>Owners and staff sign in to a dashboard with their own accounts and roles.</w:t>
+            </w:r>
+          </w:p>
+        </w:tc>
+        <w:tc>
+          <w:tcPr>
+            <w:tcW w:type="dxa" w:w="1738"/>
+          </w:tcPr>
+          <w:p>
+            <w:pPr>
+              <w:spacing w:after="0"/>
+              <w:jc w:val="left"/>
+            </w:pPr>
+            <w:r/>
+            <w:r>
+              <w:rPr>
+                <w:sz w:val="18"/>
+              </w:rPr>
+              <w:t>Owner, staff</w:t>
+            </w:r>
+          </w:p>
+        </w:tc>
+      </w:tr>
+      <w:tr>
+        <w:trPr>
+          <w:cantSplit/>
+        </w:trPr>
+        <w:tc>
+          <w:tcPr>
+            <w:tcW w:type="dxa" w:w="802"/>
+          </w:tcPr>
+          <w:p>
+            <w:pPr>
+              <w:spacing w:after="0"/>
+              <w:jc w:val="left"/>
+            </w:pPr>
+            <w:r/>
+            <w:r>
+              <w:rPr>
+                <w:sz w:val="18"/>
+              </w:rPr>
+              <w:t>FR2</w:t>
+            </w:r>
+          </w:p>
+        </w:tc>
+        <w:tc>
+          <w:tcPr>
+            <w:tcW w:type="dxa" w:w="2139"/>
+          </w:tcPr>
+          <w:p>
+            <w:pPr>
+              <w:spacing w:after="0"/>
+              <w:jc w:val="left"/>
+            </w:pPr>
+            <w:r/>
+            <w:r>
+              <w:rPr>
+                <w:sz w:val="18"/>
+              </w:rPr>
+              <w:t>Business profile</w:t>
+            </w:r>
+          </w:p>
+        </w:tc>
+        <w:tc>
+          <w:tcPr>
+            <w:tcW w:type="dxa" w:w="4680"/>
+          </w:tcPr>
+          <w:p>
+            <w:pPr>
+              <w:spacing w:after="0"/>
+              <w:jc w:val="left"/>
+            </w:pPr>
+            <w:r/>
+            <w:r>
+              <w:rPr>
+                <w:sz w:val="18"/>
+              </w:rPr>
+              <w:t>The owner sets the store name, contact details, hours, and service areas.</w:t>
+            </w:r>
+          </w:p>
+        </w:tc>
+        <w:tc>
+          <w:tcPr>
+            <w:tcW w:type="dxa" w:w="1738"/>
+          </w:tcPr>
+          <w:p>
+            <w:pPr>
+              <w:spacing w:after="0"/>
+              <w:jc w:val="left"/>
+            </w:pPr>
+            <w:r/>
+            <w:r>
+              <w:rPr>
+                <w:sz w:val="18"/>
+              </w:rPr>
+              <w:t>Owner</w:t>
+            </w:r>
+          </w:p>
+        </w:tc>
+      </w:tr>
+      <w:tr>
+        <w:trPr>
+          <w:cantSplit/>
+        </w:trPr>
+        <w:tc>
+          <w:tcPr>
+            <w:tcW w:type="dxa" w:w="802"/>
+          </w:tcPr>
+          <w:p>
+            <w:pPr>
+              <w:spacing w:after="0"/>
+              <w:jc w:val="left"/>
+            </w:pPr>
+            <w:r/>
+            <w:r>
+              <w:rPr>
+                <w:sz w:val="18"/>
+              </w:rPr>
+              <w:t>FR3</w:t>
+            </w:r>
+          </w:p>
+        </w:tc>
+        <w:tc>
+          <w:tcPr>
+            <w:tcW w:type="dxa" w:w="2139"/>
+          </w:tcPr>
+          <w:p>
+            <w:pPr>
+              <w:spacing w:after="0"/>
+              <w:jc w:val="left"/>
+            </w:pPr>
+            <w:r/>
+            <w:r>
+              <w:rPr>
+                <w:sz w:val="18"/>
+              </w:rPr>
+              <w:t>Product management</w:t>
+            </w:r>
+          </w:p>
+        </w:tc>
+        <w:tc>
+          <w:tcPr>
+            <w:tcW w:type="dxa" w:w="4680"/>
+          </w:tcPr>
+          <w:p>
+            <w:pPr>
+              <w:spacing w:after="0"/>
+              <w:jc w:val="left"/>
+            </w:pPr>
+            <w:r/>
+            <w:r>
+              <w:rPr>
+                <w:sz w:val="18"/>
+              </w:rPr>
+              <w:t>Create, edit, archive, and search products with price, stock status, variants, and delivery notes.</w:t>
+            </w:r>
+          </w:p>
+        </w:tc>
+        <w:tc>
+          <w:tcPr>
+            <w:tcW w:type="dxa" w:w="1738"/>
+          </w:tcPr>
+          <w:p>
+            <w:pPr>
+              <w:spacing w:after="0"/>
+              <w:jc w:val="left"/>
+            </w:pPr>
+            <w:r/>
+            <w:r>
+              <w:rPr>
+                <w:sz w:val="18"/>
+              </w:rPr>
+              <w:t>Owner, staff</w:t>
+            </w:r>
+          </w:p>
+        </w:tc>
+      </w:tr>
+      <w:tr>
+        <w:trPr>
+          <w:cantSplit/>
+        </w:trPr>
+        <w:tc>
+          <w:tcPr>
+            <w:tcW w:type="dxa" w:w="802"/>
+          </w:tcPr>
+          <w:p>
+            <w:pPr>
+              <w:spacing w:after="0"/>
+              <w:jc w:val="left"/>
+            </w:pPr>
+            <w:r/>
+            <w:r>
+              <w:rPr>
+                <w:sz w:val="18"/>
+              </w:rPr>
+              <w:t>FR4</w:t>
+            </w:r>
+          </w:p>
+        </w:tc>
+        <w:tc>
+          <w:tcPr>
+            <w:tcW w:type="dxa" w:w="2139"/>
+          </w:tcPr>
+          <w:p>
+            <w:pPr>
+              <w:spacing w:after="0"/>
+              <w:jc w:val="left"/>
+            </w:pPr>
+            <w:r/>
+            <w:r>
+              <w:rPr>
+                <w:sz w:val="18"/>
+              </w:rPr>
+              <w:t>FAQ and policy management</w:t>
+            </w:r>
+          </w:p>
+        </w:tc>
+        <w:tc>
+          <w:tcPr>
+            <w:tcW w:type="dxa" w:w="4680"/>
+          </w:tcPr>
+          <w:p>
+            <w:pPr>
+              <w:spacing w:after="0"/>
+              <w:jc w:val="left"/>
+            </w:pPr>
+            <w:r/>
+            <w:r>
+              <w:rPr>
+                <w:sz w:val="18"/>
+              </w:rPr>
+              <w:t>Approved answers for payment, delivery, returns, exchanges, and cancellations, with an effective date and version.</w:t>
+            </w:r>
+          </w:p>
+        </w:tc>
+        <w:tc>
+          <w:tcPr>
+            <w:tcW w:type="dxa" w:w="1738"/>
+          </w:tcPr>
+          <w:p>
+            <w:pPr>
+              <w:spacing w:after="0"/>
+              <w:jc w:val="left"/>
+            </w:pPr>
+            <w:r/>
+            <w:r>
+              <w:rPr>
+                <w:sz w:val="18"/>
+              </w:rPr>
+              <w:t>Owner</w:t>
+            </w:r>
+          </w:p>
+        </w:tc>
+      </w:tr>
+      <w:tr>
+        <w:trPr>
+          <w:cantSplit/>
+        </w:trPr>
+        <w:tc>
+          <w:tcPr>
+            <w:tcW w:type="dxa" w:w="802"/>
+          </w:tcPr>
+          <w:p>
+            <w:pPr>
+              <w:spacing w:after="0"/>
+              <w:jc w:val="left"/>
+            </w:pPr>
+            <w:r/>
+            <w:r>
+              <w:rPr>
+                <w:sz w:val="18"/>
+              </w:rPr>
+              <w:t>FR5</w:t>
+            </w:r>
+          </w:p>
+        </w:tc>
+        <w:tc>
+          <w:tcPr>
+            <w:tcW w:type="dxa" w:w="2139"/>
+          </w:tcPr>
+          <w:p>
+            <w:pPr>
+              <w:spacing w:after="0"/>
+              <w:jc w:val="left"/>
+            </w:pPr>
+            <w:r/>
+            <w:r>
+              <w:rPr>
+                <w:sz w:val="18"/>
+              </w:rPr>
+              <w:t>Customer chat</w:t>
+            </w:r>
+          </w:p>
+        </w:tc>
+        <w:tc>
+          <w:tcPr>
+            <w:tcW w:type="dxa" w:w="4680"/>
+          </w:tcPr>
+          <w:p>
+            <w:pPr>
+              <w:spacing w:after="0"/>
+              <w:jc w:val="left"/>
+            </w:pPr>
+            <w:r/>
+            <w:r>
+              <w:rPr>
+                <w:sz w:val="18"/>
+              </w:rPr>
+              <w:t>Customers ask questions in plain language through a mobile-friendly web chat.</w:t>
+            </w:r>
+          </w:p>
+        </w:tc>
+        <w:tc>
+          <w:tcPr>
+            <w:tcW w:type="dxa" w:w="1738"/>
+          </w:tcPr>
+          <w:p>
+            <w:pPr>
+              <w:spacing w:after="0"/>
+              <w:jc w:val="left"/>
+            </w:pPr>
+            <w:r/>
+            <w:r>
+              <w:rPr>
+                <w:sz w:val="18"/>
+              </w:rPr>
+              <w:t>Customer</w:t>
+            </w:r>
+          </w:p>
+        </w:tc>
+      </w:tr>
+      <w:tr>
+        <w:trPr>
+          <w:cantSplit/>
+        </w:trPr>
+        <w:tc>
+          <w:tcPr>
+            <w:tcW w:type="dxa" w:w="802"/>
+          </w:tcPr>
+          <w:p>
+            <w:pPr>
+              <w:spacing w:after="0"/>
+              <w:jc w:val="left"/>
+            </w:pPr>
+            <w:r/>
+            <w:r>
+              <w:rPr>
+                <w:sz w:val="18"/>
+              </w:rPr>
+              <w:t>FR6</w:t>
+            </w:r>
+          </w:p>
+        </w:tc>
+        <w:tc>
+          <w:tcPr>
+            <w:tcW w:type="dxa" w:w="2139"/>
+          </w:tcPr>
+          <w:p>
+            <w:pPr>
+              <w:spacing w:after="0"/>
+              <w:jc w:val="left"/>
+            </w:pPr>
+            <w:r/>
+            <w:r>
+              <w:rPr>
+                <w:sz w:val="18"/>
+              </w:rPr>
+              <w:t>Language handling</w:t>
+            </w:r>
+          </w:p>
+        </w:tc>
+        <w:tc>
+          <w:tcPr>
+            <w:tcW w:type="dxa" w:w="4680"/>
+          </w:tcPr>
+          <w:p>
+            <w:pPr>
+              <w:spacing w:after="0"/>
+              <w:jc w:val="left"/>
+            </w:pPr>
+            <w:r/>
+            <w:r>
+              <w:rPr>
+                <w:sz w:val="18"/>
+              </w:rPr>
+              <w:t>English, Filipino, and Taglish messages are accepted, and replies follow the customer's language.</w:t>
+            </w:r>
+          </w:p>
+        </w:tc>
+        <w:tc>
+          <w:tcPr>
+            <w:tcW w:type="dxa" w:w="1738"/>
+          </w:tcPr>
+          <w:p>
+            <w:pPr>
+              <w:spacing w:after="0"/>
+              <w:jc w:val="left"/>
+            </w:pPr>
+            <w:r/>
+            <w:r>
+              <w:rPr>
+                <w:sz w:val="18"/>
+              </w:rPr>
+              <w:t>System</w:t>
+            </w:r>
+          </w:p>
+        </w:tc>
+      </w:tr>
+      <w:tr>
+        <w:trPr>
+          <w:cantSplit/>
+        </w:trPr>
+        <w:tc>
+          <w:tcPr>
+            <w:tcW w:type="dxa" w:w="802"/>
+          </w:tcPr>
+          <w:p>
+            <w:pPr>
+              <w:spacing w:after="0"/>
+              <w:jc w:val="left"/>
+            </w:pPr>
+            <w:r/>
+            <w:r>
+              <w:rPr>
+                <w:sz w:val="18"/>
+              </w:rPr>
+              <w:t>FR7</w:t>
+            </w:r>
+          </w:p>
+        </w:tc>
+        <w:tc>
+          <w:tcPr>
+            <w:tcW w:type="dxa" w:w="2139"/>
+          </w:tcPr>
+          <w:p>
+            <w:pPr>
+              <w:spacing w:after="0"/>
+              <w:jc w:val="left"/>
+            </w:pPr>
+            <w:r/>
+            <w:r>
+              <w:rPr>
+                <w:sz w:val="18"/>
+              </w:rPr>
+              <w:t>Retrieval</w:t>
+            </w:r>
+          </w:p>
+        </w:tc>
+        <w:tc>
+          <w:tcPr>
+            <w:tcW w:type="dxa" w:w="4680"/>
+          </w:tcPr>
+          <w:p>
+            <w:pPr>
+              <w:spacing w:after="0"/>
+              <w:jc w:val="left"/>
+            </w:pPr>
+            <w:r/>
+            <w:r>
+              <w:rPr>
+                <w:sz w:val="18"/>
+              </w:rPr>
+              <w:t>The system finds the matching records for the current business before any reply is written.</w:t>
+            </w:r>
+          </w:p>
+        </w:tc>
+        <w:tc>
+          <w:tcPr>
+            <w:tcW w:type="dxa" w:w="1738"/>
+          </w:tcPr>
+          <w:p>
+            <w:pPr>
+              <w:spacing w:after="0"/>
+              <w:jc w:val="left"/>
+            </w:pPr>
+            <w:r/>
+            <w:r>
+              <w:rPr>
+                <w:sz w:val="18"/>
+              </w:rPr>
+              <w:t>System</w:t>
+            </w:r>
+          </w:p>
+        </w:tc>
+      </w:tr>
+      <w:tr>
+        <w:trPr>
+          <w:cantSplit/>
+        </w:trPr>
+        <w:tc>
+          <w:tcPr>
+            <w:tcW w:type="dxa" w:w="802"/>
+          </w:tcPr>
+          <w:p>
+            <w:pPr>
+              <w:spacing w:after="0"/>
+              <w:jc w:val="left"/>
+            </w:pPr>
+            <w:r/>
+            <w:r>
+              <w:rPr>
+                <w:sz w:val="18"/>
+              </w:rPr>
+              <w:t>FR8</w:t>
+            </w:r>
+          </w:p>
+        </w:tc>
+        <w:tc>
+          <w:tcPr>
+            <w:tcW w:type="dxa" w:w="2139"/>
+          </w:tcPr>
+          <w:p>
+            <w:pPr>
+              <w:spacing w:after="0"/>
+              <w:jc w:val="left"/>
+            </w:pPr>
+            <w:r/>
+            <w:r>
+              <w:rPr>
+                <w:sz w:val="18"/>
+              </w:rPr>
+              <w:t>Grounded reply</w:t>
+            </w:r>
+          </w:p>
+        </w:tc>
+        <w:tc>
+          <w:tcPr>
+            <w:tcW w:type="dxa" w:w="4680"/>
+          </w:tcPr>
+          <w:p>
+            <w:pPr>
+              <w:spacing w:after="0"/>
+              <w:jc w:val="left"/>
+            </w:pPr>
+            <w:r/>
+            <w:r>
+              <w:rPr>
+                <w:sz w:val="18"/>
+              </w:rPr>
+              <w:t>The AI writes a short answer using only the retrieved records.</w:t>
+            </w:r>
+          </w:p>
+        </w:tc>
+        <w:tc>
+          <w:tcPr>
+            <w:tcW w:type="dxa" w:w="1738"/>
+          </w:tcPr>
+          <w:p>
+            <w:pPr>
+              <w:spacing w:after="0"/>
+              <w:jc w:val="left"/>
+            </w:pPr>
+            <w:r/>
+            <w:r>
+              <w:rPr>
+                <w:sz w:val="18"/>
+              </w:rPr>
+              <w:t>System</w:t>
+            </w:r>
+          </w:p>
+        </w:tc>
+      </w:tr>
+      <w:tr>
+        <w:trPr>
+          <w:cantSplit/>
+        </w:trPr>
+        <w:tc>
+          <w:tcPr>
+            <w:tcW w:type="dxa" w:w="802"/>
+          </w:tcPr>
+          <w:p>
+            <w:pPr>
+              <w:spacing w:after="0"/>
+              <w:jc w:val="left"/>
+            </w:pPr>
+            <w:r/>
+            <w:r>
+              <w:rPr>
+                <w:sz w:val="18"/>
+              </w:rPr>
+              <w:t>FR9</w:t>
+            </w:r>
+          </w:p>
+        </w:tc>
+        <w:tc>
+          <w:tcPr>
+            <w:tcW w:type="dxa" w:w="2139"/>
+          </w:tcPr>
+          <w:p>
+            <w:pPr>
+              <w:spacing w:after="0"/>
+              <w:jc w:val="left"/>
+            </w:pPr>
+            <w:r/>
+            <w:r>
+              <w:rPr>
+                <w:sz w:val="18"/>
+              </w:rPr>
+              <w:t>Confidence and safety check</w:t>
+            </w:r>
+          </w:p>
+        </w:tc>
+        <w:tc>
+          <w:tcPr>
+            <w:tcW w:type="dxa" w:w="4680"/>
+          </w:tcPr>
+          <w:p>
+            <w:pPr>
+              <w:spacing w:after="0"/>
+              <w:jc w:val="left"/>
+            </w:pPr>
+            <w:r/>
+            <w:r>
+              <w:rPr>
+                <w:sz w:val="18"/>
+              </w:rPr>
+              <w:t>Replies without enough support are not sent.</w:t>
+            </w:r>
+          </w:p>
+        </w:tc>
+        <w:tc>
+          <w:tcPr>
+            <w:tcW w:type="dxa" w:w="1738"/>
+          </w:tcPr>
+          <w:p>
+            <w:pPr>
+              <w:spacing w:after="0"/>
+              <w:jc w:val="left"/>
+            </w:pPr>
+            <w:r/>
+            <w:r>
+              <w:rPr>
+                <w:sz w:val="18"/>
+              </w:rPr>
+              <w:t>System</w:t>
+            </w:r>
+          </w:p>
+        </w:tc>
+      </w:tr>
+      <w:tr>
+        <w:trPr>
+          <w:cantSplit/>
+        </w:trPr>
+        <w:tc>
+          <w:tcPr>
+            <w:tcW w:type="dxa" w:w="802"/>
+          </w:tcPr>
+          <w:p>
+            <w:pPr>
+              <w:spacing w:after="0"/>
+              <w:jc w:val="left"/>
+            </w:pPr>
+            <w:r/>
+            <w:r>
+              <w:rPr>
+                <w:sz w:val="18"/>
+              </w:rPr>
+              <w:t>FR10</w:t>
+            </w:r>
+          </w:p>
+        </w:tc>
+        <w:tc>
+          <w:tcPr>
+            <w:tcW w:type="dxa" w:w="2139"/>
+          </w:tcPr>
+          <w:p>
+            <w:pPr>
+              <w:spacing w:after="0"/>
+              <w:jc w:val="left"/>
+            </w:pPr>
+            <w:r/>
+            <w:r>
+              <w:rPr>
+                <w:sz w:val="18"/>
+              </w:rPr>
+              <w:t>Escalation</w:t>
+            </w:r>
+          </w:p>
+        </w:tc>
+        <w:tc>
+          <w:tcPr>
+            <w:tcW w:type="dxa" w:w="4680"/>
+          </w:tcPr>
+          <w:p>
+            <w:pPr>
+              <w:spacing w:after="0"/>
+              <w:jc w:val="left"/>
+            </w:pPr>
+            <w:r/>
+            <w:r>
+              <w:rPr>
+                <w:sz w:val="18"/>
+              </w:rPr>
+              <w:t>Complaints, refunds, sensitive data, and low-confidence cases go to a staff queue.</w:t>
+            </w:r>
+          </w:p>
+        </w:tc>
+        <w:tc>
+          <w:tcPr>
+            <w:tcW w:type="dxa" w:w="1738"/>
+          </w:tcPr>
+          <w:p>
+            <w:pPr>
+              <w:spacing w:after="0"/>
+              <w:jc w:val="left"/>
+            </w:pPr>
+            <w:r/>
+            <w:r>
+              <w:rPr>
+                <w:sz w:val="18"/>
+              </w:rPr>
+              <w:t>System, staff</w:t>
+            </w:r>
+          </w:p>
+        </w:tc>
+      </w:tr>
+      <w:tr>
+        <w:trPr>
+          <w:cantSplit/>
+        </w:trPr>
+        <w:tc>
+          <w:tcPr>
+            <w:tcW w:type="dxa" w:w="802"/>
+          </w:tcPr>
+          <w:p>
+            <w:pPr>
+              <w:spacing w:after="0"/>
+              <w:jc w:val="left"/>
+            </w:pPr>
+            <w:r/>
+            <w:r>
+              <w:rPr>
+                <w:sz w:val="18"/>
+              </w:rPr>
+              <w:t>FR11</w:t>
+            </w:r>
+          </w:p>
+        </w:tc>
+        <w:tc>
+          <w:tcPr>
+            <w:tcW w:type="dxa" w:w="2139"/>
+          </w:tcPr>
+          <w:p>
+            <w:pPr>
+              <w:spacing w:after="0"/>
+              <w:jc w:val="left"/>
+            </w:pPr>
+            <w:r/>
+            <w:r>
+              <w:rPr>
+                <w:sz w:val="18"/>
+              </w:rPr>
+              <w:t>Conversation log</w:t>
+            </w:r>
+          </w:p>
+        </w:tc>
+        <w:tc>
+          <w:tcPr>
+            <w:tcW w:type="dxa" w:w="4680"/>
+          </w:tcPr>
+          <w:p>
+            <w:pPr>
+              <w:spacing w:after="0"/>
+              <w:jc w:val="left"/>
+            </w:pPr>
+            <w:r/>
+            <w:r>
+              <w:rPr>
+                <w:sz w:val="18"/>
+              </w:rPr>
+              <w:t>Staff can review past conversations and the record used for each reply.</w:t>
+            </w:r>
+          </w:p>
+        </w:tc>
+        <w:tc>
+          <w:tcPr>
+            <w:tcW w:type="dxa" w:w="1738"/>
+          </w:tcPr>
+          <w:p>
+            <w:pPr>
+              <w:spacing w:after="0"/>
+              <w:jc w:val="left"/>
+            </w:pPr>
+            <w:r/>
+            <w:r>
+              <w:rPr>
+                <w:sz w:val="18"/>
+              </w:rPr>
+              <w:t>Staff</w:t>
+            </w:r>
+          </w:p>
+        </w:tc>
+      </w:tr>
+      <w:tr>
+        <w:trPr>
+          <w:cantSplit/>
+        </w:trPr>
+        <w:tc>
+          <w:tcPr>
+            <w:tcW w:type="dxa" w:w="802"/>
+          </w:tcPr>
+          <w:p>
+            <w:pPr>
+              <w:spacing w:after="0"/>
+              <w:jc w:val="left"/>
+            </w:pPr>
+            <w:r/>
+            <w:r>
+              <w:rPr>
+                <w:sz w:val="18"/>
+              </w:rPr>
+              <w:t>FR12</w:t>
+            </w:r>
+          </w:p>
+        </w:tc>
+        <w:tc>
+          <w:tcPr>
+            <w:tcW w:type="dxa" w:w="2139"/>
+          </w:tcPr>
+          <w:p>
+            <w:pPr>
+              <w:spacing w:after="0"/>
+              <w:jc w:val="left"/>
+            </w:pPr>
+            <w:r/>
+            <w:r>
+              <w:rPr>
+                <w:sz w:val="18"/>
+              </w:rPr>
+              <w:t>Feedback</w:t>
+            </w:r>
+          </w:p>
+        </w:tc>
+        <w:tc>
+          <w:tcPr>
+            <w:tcW w:type="dxa" w:w="4680"/>
+          </w:tcPr>
+          <w:p>
+            <w:pPr>
+              <w:spacing w:after="0"/>
+              <w:jc w:val="left"/>
+            </w:pPr>
+            <w:r/>
+            <w:r>
+              <w:rPr>
+                <w:sz w:val="18"/>
+              </w:rPr>
+              <w:t>Customers and staff can mark a reply as helpful or not helpful.</w:t>
+            </w:r>
+          </w:p>
+        </w:tc>
+        <w:tc>
+          <w:tcPr>
+            <w:tcW w:type="dxa" w:w="1738"/>
+          </w:tcPr>
+          <w:p>
+            <w:pPr>
+              <w:spacing w:after="0"/>
+              <w:jc w:val="left"/>
+            </w:pPr>
+            <w:r/>
+            <w:r>
+              <w:rPr>
+                <w:sz w:val="18"/>
+              </w:rPr>
+              <w:t>Customer, staff</w:t>
+            </w:r>
+          </w:p>
+        </w:tc>
+      </w:tr>
+      <w:tr>
+        <w:trPr>
+          <w:cantSplit/>
+        </w:trPr>
+        <w:tc>
+          <w:tcPr>
+            <w:tcW w:type="dxa" w:w="802"/>
+          </w:tcPr>
+          <w:p>
+            <w:pPr>
+              <w:spacing w:after="0"/>
+              <w:jc w:val="left"/>
+            </w:pPr>
+            <w:r/>
+            <w:r>
+              <w:rPr>
+                <w:sz w:val="18"/>
+              </w:rPr>
+              <w:t>FR13</w:t>
+            </w:r>
+          </w:p>
+        </w:tc>
+        <w:tc>
+          <w:tcPr>
+            <w:tcW w:type="dxa" w:w="2139"/>
+          </w:tcPr>
+          <w:p>
+            <w:pPr>
+              <w:spacing w:after="0"/>
+              <w:jc w:val="left"/>
+            </w:pPr>
+            <w:r/>
+            <w:r>
+              <w:rPr>
+                <w:sz w:val="18"/>
+              </w:rPr>
+              <w:t>Reports</w:t>
+            </w:r>
+          </w:p>
+        </w:tc>
+        <w:tc>
+          <w:tcPr>
+            <w:tcW w:type="dxa" w:w="4680"/>
+          </w:tcPr>
+          <w:p>
+            <w:pPr>
+              <w:spacing w:after="0"/>
+              <w:jc w:val="left"/>
+            </w:pPr>
+            <w:r/>
+            <w:r>
+              <w:rPr>
+                <w:sz w:val="18"/>
+              </w:rPr>
+              <w:t>Counts of inquiries by topic, escalations, reply times, and ratings.</w:t>
+            </w:r>
+          </w:p>
+        </w:tc>
+        <w:tc>
+          <w:tcPr>
+            <w:tcW w:type="dxa" w:w="1738"/>
+          </w:tcPr>
+          <w:p>
+            <w:pPr>
+              <w:spacing w:after="0"/>
+              <w:jc w:val="left"/>
+            </w:pPr>
+            <w:r/>
+            <w:r>
+              <w:rPr>
+                <w:sz w:val="18"/>
+              </w:rPr>
+              <w:t>Owner</w:t>
+            </w:r>
+          </w:p>
+        </w:tc>
+      </w:tr>
+    </w:tbl>
     <w:p>
       <w:pPr>
-        <w:pStyle w:val="ListBullet"/>
-        <w:jc w:val="left"/>
-      </w:pPr>
-      <w:r>
-        <w:t>FR2 Business profile: the owner sets the store name, contact details, hours, and service areas.</w:t>
-      </w:r>
-    </w:p>
-    <w:p>
-      <w:pPr>
-        <w:pStyle w:val="ListBullet"/>
-        <w:jc w:val="left"/>
-      </w:pPr>
-      <w:r>
-        <w:t>FR3 Product management: create, edit, archive, and search products with price, stock status, variants, and delivery notes.</w:t>
-      </w:r>
-    </w:p>
-    <w:p>
-      <w:pPr>
-        <w:pStyle w:val="ListBullet"/>
-        <w:jc w:val="left"/>
-      </w:pPr>
-      <w:r>
-        <w:t>FR4 FAQ and policy management: approved answers for payment, delivery, returns, exchanges, and cancellations, with an effective date and version.</w:t>
-      </w:r>
-    </w:p>
-    <w:p>
-      <w:pPr>
-        <w:pStyle w:val="ListBullet"/>
-        <w:jc w:val="left"/>
-      </w:pPr>
-      <w:r>
-        <w:t>FR5 Customer chat: customers ask questions in plain language through a mobile-friendly web chat.</w:t>
-      </w:r>
-    </w:p>
-    <w:p>
-      <w:pPr>
-        <w:pStyle w:val="ListBullet"/>
-        <w:jc w:val="left"/>
-      </w:pPr>
-      <w:r>
-        <w:t>FR6 Language handling: English, Filipino, and Taglish messages are accepted, and replies follow the customer's language.</w:t>
-      </w:r>
-    </w:p>
-    <w:p>
-      <w:pPr>
-        <w:pStyle w:val="ListBullet"/>
-        <w:jc w:val="left"/>
-      </w:pPr>
-      <w:r>
-        <w:t>FR7 Retrieval: the system finds the matching records for the current business before any reply is written.</w:t>
-      </w:r>
-    </w:p>
-    <w:p>
-      <w:pPr>
-        <w:pStyle w:val="ListBullet"/>
-        <w:jc w:val="left"/>
-      </w:pPr>
-      <w:r>
-        <w:t>FR8 Grounded reply: the AI writes a short answer using only the retrieved records.</w:t>
-      </w:r>
-    </w:p>
-    <w:p>
-      <w:pPr>
-        <w:pStyle w:val="ListBullet"/>
-        <w:jc w:val="left"/>
-      </w:pPr>
-      <w:r>
-        <w:t>FR9 Confidence and safety check: replies without enough support are not sent.</w:t>
-      </w:r>
-    </w:p>
-    <w:p>
-      <w:pPr>
-        <w:pStyle w:val="ListBullet"/>
-        <w:jc w:val="left"/>
-      </w:pPr>
-      <w:r>
-        <w:t>FR10 Escalation: complaints, refunds, sensitive data, and low-confidence cases go to a staff queue.</w:t>
-      </w:r>
-    </w:p>
-    <w:p>
-      <w:pPr>
-        <w:pStyle w:val="ListBullet"/>
-        <w:jc w:val="left"/>
-      </w:pPr>
-      <w:r>
-        <w:t>FR11 Conversation log: staff can review past conversations and the record used for each reply.</w:t>
-      </w:r>
-    </w:p>
-    <w:p>
-      <w:pPr>
-        <w:pStyle w:val="ListBullet"/>
-        <w:jc w:val="left"/>
-      </w:pPr>
-      <w:r>
-        <w:t>FR12 Feedback: customers and staff can mark a reply as helpful or not helpful.</w:t>
-      </w:r>
-    </w:p>
-    <w:p>
-      <w:pPr>
-        <w:pStyle w:val="ListBullet"/>
-        <w:jc w:val="left"/>
-      </w:pPr>
-      <w:r>
-        <w:t>FR13 Reports: counts of inquiries by topic, escalations, reply times, and ratings.</w:t>
-      </w:r>
+        <w:spacing w:after="40"/>
+      </w:pPr>
     </w:p>
     <w:p>
       <w:pPr>
@@ -2885,7 +3896,7 @@
         <w:jc w:val="both"/>
       </w:pPr>
       <w:r>
-        <w:t>The knowledge base is the system's single source of truth. Each seller keeps separate product, FAQ, and policy records. Product records hold the name, description, price, stock status, variants, and last update date. FAQ and policy records hold the question, the approved answer, the category, the language, the version, the effective date, and an active flag. Table 3 shows sample records. The values are fictional.</w:t>
+        <w:t>The knowledge base is the system's single source of truth. Each seller keeps separate product, FAQ, and policy records. Product records hold the name, description, price, stock status, variants, and last update date. FAQ and policy records hold the question, the approved answer, the category, the language, the version, the effective date, and an active flag. Table 4 shows sample records. The values are fictional.</w:t>
       </w:r>
     </w:p>
     <w:p>
@@ -2899,7 +3910,7 @@
           <w:b/>
           <w:sz w:val="17"/>
         </w:rPr>
-        <w:t>Table 3: Sample knowledge records (fictional values)</w:t>
+        <w:t>Table 4: Sample knowledge records (fictional values)</w:t>
       </w:r>
     </w:p>
     <w:tbl>
@@ -3909,7 +4920,7 @@
         <w:jc w:val="both"/>
       </w:pPr>
       <w:r>
-        <w:t>Table 4 lists the hardware, software, and cloud requirements for the prototype. A single small cloud server can host the prototype and the first group of sellers. The design avoids tying the system to one vendor: the language model is called through an interface that can be switched to another provider, and PostgreSQL with the pgvector extension handles both structured data and vector search, so no separate vector database is needed at this scale.</w:t>
+        <w:t>Table 5 lists the hardware, software, and cloud requirements for the prototype. A single small cloud server can host the prototype and the first group of sellers. The design avoids tying the system to one vendor: the language model is called through an interface that can be switched to another provider, and PostgreSQL with the pgvector extension handles both structured data and vector search, so no separate vector database is needed at this scale.</w:t>
       </w:r>
     </w:p>
     <w:p>
@@ -3923,7 +4934,7 @@
           <w:b/>
           <w:sz w:val="17"/>
         </w:rPr>
-        <w:t>Table 4: Technical requirements</w:t>
+        <w:t>Table 5: Technical requirements</w:t>
       </w:r>
     </w:p>
     <w:tbl>
@@ -4535,7 +5546,7 @@
         <w:jc w:val="both"/>
       </w:pPr>
       <w:r>
-        <w:t>The system follows a B2B software-as-a-service model. The paying customer is the seller, not the buyer. The value offered is simple: fewer repeated replies, answers that match what the owner approved, and a clear record of what was said. Table 5 summarizes the model.</w:t>
+        <w:t>The system follows a B2B software-as-a-service model. The paying customer is the seller, not the buyer. The value offered is simple: fewer repeated replies, answers that match what the owner approved, and a clear record of what was said. Table 6 summarizes the model.</w:t>
       </w:r>
     </w:p>
     <w:p>
@@ -4549,7 +5560,7 @@
           <w:b/>
           <w:sz w:val="17"/>
         </w:rPr>
-        <w:t>Table 5: Business and sustainability model</w:t>
+        <w:t>Table 6: Business and sustainability model</w:t>
       </w:r>
     </w:p>
     <w:tbl>
@@ -5110,7 +6121,7 @@
         <w:jc w:val="both"/>
       </w:pPr>
       <w:r>
-        <w:t>Table 6 lists the main risks and how the design responds to each.</w:t>
+        <w:t>Table 7 lists the main risks and how the design responds to each.</w:t>
       </w:r>
     </w:p>
     <w:p>
@@ -5124,7 +6135,7 @@
           <w:b/>
           <w:sz w:val="17"/>
         </w:rPr>
-        <w:t>Table 6: Main risks and mitigation</w:t>
+        <w:t>Table 7: Main risks and mitigation</w:t>
       </w:r>
     </w:p>
     <w:tbl>
@@ -5704,7 +6715,7 @@
         <w:jc w:val="both"/>
       </w:pPr>
       <w:r>
-        <w:t>The design produced the following deliverables: a requirements specification (Sections 4.2 and 4.3), a conceptual framework, use case diagram, architecture, and program flowchart (Figures 1 to 4), a knowledge base with business rules and a relational data model (Section 4.8 and Figure 5), customer and owner interface mockups (Figures 6 and 7), technical requirements (Table 4), a business model and preliminary plan (Sections 4.13 and 4.14), and an evaluation plan with measurable targets (Table 1). The central rule running through all of them is that the owner's records, and not the model's general knowledge, decide what customers are told.</w:t>
+        <w:t>The design produced the following deliverables: a requirements specification (Sections 4.2 and 4.3), a conceptual framework, use case diagram, architecture, and program flowchart (Figures 1 to 4), a knowledge base with business rules and a relational data model (Section 4.8 and Figure 5), customer and owner interface mockups (Figures 6 and 7), technical requirements (Table 5), a business model and preliminary plan (Sections 4.13 and 4.14), and an evaluation plan with measurable targets (Table 1). The central rule running through all of them is that the owner's records, and not the model's general knowledge, decide what customers are told.</w:t>
       </w:r>
     </w:p>
     <w:p>

</xml_diff>